<commit_message>
Stage 3 plans the Tests the Client requested, with Nitrosamine impurities (#82)
Stage 1 reads TESTS REQUESTED and LIMITS into each Sample line of the
submission/2 record. Stage 3 takes that record beside the Receiving Log
row, gives each Lab Reference its line, and maps each request to a Test
definition by its words: Average capsule weight, or Nitrosamine impurities
with one analyte per nitrosamine named and its limit (ng/day, ppm or ng/g;
other text kept as "unread:"). An unmappable request is refused with its
words; an FP line requesting nothing keeps Average capsule weight, so
seeds 1, 2 and 4 plan the same Work Orders. The Work Order gains Analyte
and Limit columns; work_orders keeps one row per Sample and Test.

The improvised RM and IP lines now request two nitrosamines (regenerated
through synth.improvise); their known gaps move to stage 4, naming #85.

Co-Authored-By: Claude Opus 5.5 <noreply@anthropic.com>
</commit_message>
<xml_diff>
--- a/fixtures/real-layout/improvised/received-2026-05-05.docx
+++ b/fixtures/real-layout/improvised/received-2026-05-05.docx
@@ -2726,7 +2726,7 @@
               <w:jc w:val="center"/>
             </w:pPr>
             <w:r>
-              <w:t>Identification</w:t>
+              <w:t>Nitrosamines: NMPA, NDMA</w:t>
             </w:r>
           </w:p>
         </w:tc>
@@ -2739,7 +2739,7 @@
               <w:jc w:val="center"/>
             </w:pPr>
             <w:r>
-              <w:t>WAKEDXK &lt; 13.2ng/day</w:t>
+              <w:t>NMPA: 19.5 ng/day; NDMA: 0.06 ppm</w:t>
             </w:r>
           </w:p>
         </w:tc>

</xml_diff>